<commit_message>
Update GitHub repository URL to https://github.com/Sakshi-M16/blockchain-student-attendance
</commit_message>
<xml_diff>
--- a/YourName_RegNum_BT_Assignment2.docx
+++ b/YourName_RegNum_BT_Assignment2.docx
@@ -198,11 +198,9 @@
           <w:p>
             <w:r>
               <w:rPr>
-                <w:i/>
-                <w:color w:val="2563EB"/>
                 <w:sz w:val="22"/>
               </w:rPr>
-              <w:t>https://github.com/[YourUsername]/blockchain-student-attendance</w:t>
+              <w:t>https://github.com/Sakshi-M16/blockchain-student-attendance</w:t>
             </w:r>
           </w:p>
         </w:tc>

</xml_diff>

<commit_message>
Add official submission files for Sakshi Mukherjee (Reg: 220905246)
</commit_message>
<xml_diff>
--- a/YourName_RegNum_BT_Assignment2.docx
+++ b/YourName_RegNum_BT_Assignment2.docx
@@ -66,11 +66,9 @@
           <w:p>
             <w:r>
               <w:rPr>
-                <w:i/>
-                <w:color w:val="2563EB"/>
                 <w:sz w:val="22"/>
               </w:rPr>
-              <w:t>[Student Name]</w:t>
+              <w:t>Sakshi Mukherjee</w:t>
             </w:r>
           </w:p>
         </w:tc>
@@ -100,11 +98,9 @@
           <w:p>
             <w:r>
               <w:rPr>
-                <w:i/>
-                <w:color w:val="2563EB"/>
                 <w:sz w:val="22"/>
               </w:rPr>
-              <w:t>[Registration Number]</w:t>
+              <w:t>220905246</w:t>
             </w:r>
           </w:p>
         </w:tc>

</xml_diff>